<commit_message>
Add interactive project demos and inline certification dates
</commit_message>
<xml_diff>
--- a/assets/Rahul_Raj_V_C_Resume.docx
+++ b/assets/Rahul_Raj_V_C_Resume.docx
@@ -547,11 +547,8 @@
     </w:p>
     <w:p>
       <w:pPr>
-        <w:tabs>
-          <w:tab w:pos="10339" w:val="right"/>
-        </w:tabs>
-        <w:spacing w:after="40" w:line="250" w:lineRule="auto"/>
-        <w:ind w:left="259" w:hanging="230" w:right="0"/>
+        <w:spacing w:after="70" w:line="259" w:lineRule="auto"/>
+        <w:ind w:left="259" w:hanging="230"/>
       </w:pPr>
       <w:r>
         <w:rPr>
@@ -569,28 +566,13 @@
           <w:color w:val="000000"/>
           <w:sz w:val="21"/>
         </w:rPr>
-        <w:t>Claroty Implementation Engineer - IND (CIE 401) | Claroty</w:t>
-      </w:r>
-      <w:r>
-        <w:tab/>
-      </w:r>
-      <w:r>
-        <w:rPr>
-          <w:rFonts w:ascii="Arial" w:hAnsi="Arial"/>
-          <w:b w:val="0"/>
-          <w:color w:val="000000"/>
-          <w:sz w:val="21"/>
-        </w:rPr>
-        <w:t>December 2025</w:t>
+        <w:t>Claroty Implementation Engineer - IND (CIE 401) | Claroty (December 2025)</w:t>
       </w:r>
     </w:p>
     <w:p>
       <w:pPr>
-        <w:tabs>
-          <w:tab w:pos="10339" w:val="right"/>
-        </w:tabs>
-        <w:spacing w:after="40" w:line="250" w:lineRule="auto"/>
-        <w:ind w:left="259" w:hanging="230" w:right="0"/>
+        <w:spacing w:after="70" w:line="259" w:lineRule="auto"/>
+        <w:ind w:left="259" w:hanging="230"/>
       </w:pPr>
       <w:r>
         <w:rPr>
@@ -608,28 +590,13 @@
           <w:color w:val="000000"/>
           <w:sz w:val="21"/>
         </w:rPr>
-        <w:t>Claroty Cybersecurity Analyst | Claroty</w:t>
-      </w:r>
-      <w:r>
-        <w:tab/>
-      </w:r>
-      <w:r>
-        <w:rPr>
-          <w:rFonts w:ascii="Arial" w:hAnsi="Arial"/>
-          <w:b w:val="0"/>
-          <w:color w:val="000000"/>
-          <w:sz w:val="21"/>
-        </w:rPr>
-        <w:t>May 2025</w:t>
+        <w:t>Claroty Cybersecurity Analyst | Claroty (May 2025)</w:t>
       </w:r>
     </w:p>
     <w:p>
       <w:pPr>
-        <w:tabs>
-          <w:tab w:pos="10339" w:val="right"/>
-        </w:tabs>
-        <w:spacing w:after="40" w:line="250" w:lineRule="auto"/>
-        <w:ind w:left="259" w:hanging="230" w:right="0"/>
+        <w:spacing w:after="70" w:line="259" w:lineRule="auto"/>
+        <w:ind w:left="259" w:hanging="230"/>
       </w:pPr>
       <w:r>
         <w:rPr>
@@ -647,28 +614,13 @@
           <w:color w:val="000000"/>
           <w:sz w:val="21"/>
         </w:rPr>
-        <w:t>SailPoint Certified IdentityIQ Associate | SailPoint</w:t>
-      </w:r>
-      <w:r>
-        <w:tab/>
-      </w:r>
-      <w:r>
-        <w:rPr>
-          <w:rFonts w:ascii="Arial" w:hAnsi="Arial"/>
-          <w:b w:val="0"/>
-          <w:color w:val="000000"/>
-          <w:sz w:val="21"/>
-        </w:rPr>
-        <w:t>January 2025</w:t>
+        <w:t>SailPoint Certified IdentityIQ Associate | SailPoint (January 2025)</w:t>
       </w:r>
     </w:p>
     <w:p>
       <w:pPr>
-        <w:tabs>
-          <w:tab w:pos="10339" w:val="right"/>
-        </w:tabs>
-        <w:spacing w:after="40" w:line="250" w:lineRule="auto"/>
-        <w:ind w:left="259" w:hanging="230" w:right="0"/>
+        <w:spacing w:after="70" w:line="259" w:lineRule="auto"/>
+        <w:ind w:left="259" w:hanging="230"/>
       </w:pPr>
       <w:r>
         <w:rPr>
@@ -686,19 +638,7 @@
           <w:color w:val="000000"/>
           <w:sz w:val="21"/>
         </w:rPr>
-        <w:t>IBM Certified Analyst - Security QRadar SIEM V7.4.3 | IBM | Exam code C9002900</w:t>
-      </w:r>
-      <w:r>
-        <w:tab/>
-      </w:r>
-      <w:r>
-        <w:rPr>
-          <w:rFonts w:ascii="Arial" w:hAnsi="Arial"/>
-          <w:b w:val="0"/>
-          <w:color w:val="000000"/>
-          <w:sz w:val="21"/>
-        </w:rPr>
-        <w:t>August 2022</w:t>
+        <w:t>IBM Certified Analyst - Security QRadar SIEM V7.4.3 | IBM | Exam code C9002900 (August 2022)</w:t>
       </w:r>
     </w:p>
     <w:p>

</xml_diff>